<commit_message>
Add environment evidence to launch packet (Section 4 architecture, 5 evidence)
Co-Authored-By: Claude Sonnet 5 <noreply@anthropic.com>
</commit_message>
<xml_diff>
--- a/docs/CISC699_Launch_Packet.docx
+++ b/docs/CISC699_Launch_Packet.docx
@@ -4770,6 +4770,786 @@
           <w:szCs w:val="22"/>
         </w:rPr>
         <w:t xml:space="preserve">A running, dated engineering log (ENGINEERING_LOG.md) was started this week at the project root, documenting the code-audit findings that motivated this scope, the real end-to-end case captured from the live system, and this week's scoping decisions. It will be updated at each milestone going forward.</w:t>
+      </w:r>
+    </w:p>
+    <w:p>
+      <w:pPr>
+        <w:keepNext/>
+        <w:spacing w:after="100" w:before="200" w:line="264"/>
+      </w:pPr>
+      <w:r>
+        <w:rPr>
+          <w:rFonts w:ascii="Calibri" w:cs="Calibri" w:eastAsia="Calibri" w:hAnsi="Calibri"/>
+          <w:b/>
+          <w:bCs/>
+          <w:color w:val="0A3A35"/>
+          <w:sz w:val="24"/>
+          <w:szCs w:val="24"/>
+        </w:rPr>
+        <w:t xml:space="preserve">Environment Evidence</w:t>
+      </w:r>
+    </w:p>
+    <w:p>
+      <w:pPr>
+        <w:spacing w:after="120" w:before="0" w:line="264"/>
+        <w:jc w:val="both"/>
+      </w:pPr>
+      <w:r>
+        <w:rPr>
+          <w:rFonts w:ascii="Calibri" w:cs="Calibri" w:eastAsia="Calibri" w:hAnsi="Calibri"/>
+          <w:sz w:val="22"/>
+          <w:szCs w:val="22"/>
+        </w:rPr>
+        <w:t xml:space="preserve">Captured directly from a live terminal session in the project root.</w:t>
+      </w:r>
+    </w:p>
+    <w:p>
+      <w:pPr>
+        <w:keepNext/>
+        <w:spacing w:after="60" w:before="120" w:line="264"/>
+      </w:pPr>
+      <w:r>
+        <w:rPr>
+          <w:rFonts w:ascii="Calibri" w:cs="Calibri" w:eastAsia="Calibri" w:hAnsi="Calibri"/>
+          <w:b/>
+          <w:bCs/>
+          <w:i/>
+          <w:iCs/>
+          <w:sz w:val="22"/>
+          <w:szCs w:val="22"/>
+        </w:rPr>
+        <w:t xml:space="preserve">Environment inventory</w:t>
+      </w:r>
+    </w:p>
+    <w:p>
+      <w:pPr>
+        <w:pBdr>
+          <w:top w:val="single" w:color="CCCCCC" w:sz="2"/>
+          <w:bottom w:val="single" w:color="CCCCCC" w:sz="2"/>
+          <w:left w:val="single" w:color="CCCCCC" w:sz="2"/>
+          <w:right w:val="single" w:color="CCCCCC" w:sz="2"/>
+        </w:pBdr>
+        <w:shd w:fill="F2F2F2" w:val="clear"/>
+        <w:spacing w:after="160" w:before="80" w:line="230"/>
+      </w:pPr>
+      <w:r>
+        <w:rPr>
+          <w:rFonts w:ascii="Courier New" w:cs="Courier New" w:eastAsia="Courier New" w:hAnsi="Courier New"/>
+          <w:sz w:val="18"/>
+          <w:szCs w:val="18"/>
+        </w:rPr>
+        <w:t xml:space="preserve">% node -v &amp;&amp; npm -v &amp;&amp; npx cdk --version &amp;&amp; aws --version</w:t>
+      </w:r>
+      <w:r>
+        <w:rPr>
+          <w:rFonts w:ascii="Courier New" w:cs="Courier New" w:eastAsia="Courier New" w:hAnsi="Courier New"/>
+          <w:sz w:val="18"/>
+          <w:szCs w:val="18"/>
+        </w:rPr>
+        <w:br/>
+        <w:t xml:space="preserve">v25.9.0</w:t>
+      </w:r>
+      <w:r>
+        <w:rPr>
+          <w:rFonts w:ascii="Courier New" w:cs="Courier New" w:eastAsia="Courier New" w:hAnsi="Courier New"/>
+          <w:sz w:val="18"/>
+          <w:szCs w:val="18"/>
+        </w:rPr>
+        <w:br/>
+        <w:t xml:space="preserve">11.12.1</w:t>
+      </w:r>
+      <w:r>
+        <w:rPr>
+          <w:rFonts w:ascii="Courier New" w:cs="Courier New" w:eastAsia="Courier New" w:hAnsi="Courier New"/>
+          <w:sz w:val="18"/>
+          <w:szCs w:val="18"/>
+        </w:rPr>
+        <w:br/>
+        <w:t xml:space="preserve">2.1131.0 (build 1e9a1e1)</w:t>
+      </w:r>
+      <w:r>
+        <w:rPr>
+          <w:rFonts w:ascii="Courier New" w:cs="Courier New" w:eastAsia="Courier New" w:hAnsi="Courier New"/>
+          <w:sz w:val="18"/>
+          <w:szCs w:val="18"/>
+        </w:rPr>
+        <w:br/>
+        <w:t xml:space="preserve">aws-cli/2.35.22 Python/3.14.6 Darwin/25.1.0 exe/arm64</w:t>
+      </w:r>
+    </w:p>
+    <w:p>
+      <w:pPr>
+        <w:keepNext/>
+        <w:spacing w:after="60" w:before="120" w:line="264"/>
+      </w:pPr>
+      <w:r>
+        <w:rPr>
+          <w:rFonts w:ascii="Calibri" w:cs="Calibri" w:eastAsia="Calibri" w:hAnsi="Calibri"/>
+          <w:b/>
+          <w:bCs/>
+          <w:i/>
+          <w:iCs/>
+          <w:sz w:val="22"/>
+          <w:szCs w:val="22"/>
+        </w:rPr>
+        <w:t xml:space="preserve">Repository state</w:t>
+      </w:r>
+    </w:p>
+    <w:p>
+      <w:pPr>
+        <w:pBdr>
+          <w:top w:val="single" w:color="CCCCCC" w:sz="2"/>
+          <w:bottom w:val="single" w:color="CCCCCC" w:sz="2"/>
+          <w:left w:val="single" w:color="CCCCCC" w:sz="2"/>
+          <w:right w:val="single" w:color="CCCCCC" w:sz="2"/>
+        </w:pBdr>
+        <w:shd w:fill="F2F2F2" w:val="clear"/>
+        <w:spacing w:after="160" w:before="80" w:line="230"/>
+      </w:pPr>
+      <w:r>
+        <w:rPr>
+          <w:rFonts w:ascii="Courier New" w:cs="Courier New" w:eastAsia="Courier New" w:hAnsi="Courier New"/>
+          <w:sz w:val="18"/>
+          <w:szCs w:val="18"/>
+        </w:rPr>
+        <w:t xml:space="preserve">% git log --oneline --all &amp;&amp; echo "---" &amp;&amp; git status</w:t>
+      </w:r>
+      <w:r>
+        <w:rPr>
+          <w:rFonts w:ascii="Courier New" w:cs="Courier New" w:eastAsia="Courier New" w:hAnsi="Courier New"/>
+          <w:sz w:val="18"/>
+          <w:szCs w:val="18"/>
+        </w:rPr>
+        <w:br/>
+        <w:t xml:space="preserve">a352707 Initial commit: RescueNet blackboard multi-agent animal-rescue system</w:t>
+      </w:r>
+      <w:r>
+        <w:rPr>
+          <w:rFonts w:ascii="Courier New" w:cs="Courier New" w:eastAsia="Courier New" w:hAnsi="Courier New"/>
+          <w:sz w:val="18"/>
+          <w:szCs w:val="18"/>
+        </w:rPr>
+        <w:br/>
+        <w:t xml:space="preserve">---</w:t>
+      </w:r>
+      <w:r>
+        <w:rPr>
+          <w:rFonts w:ascii="Courier New" w:cs="Courier New" w:eastAsia="Courier New" w:hAnsi="Courier New"/>
+          <w:sz w:val="18"/>
+          <w:szCs w:val="18"/>
+        </w:rPr>
+        <w:br/>
+        <w:t xml:space="preserve">On branch main</w:t>
+      </w:r>
+      <w:r>
+        <w:rPr>
+          <w:rFonts w:ascii="Courier New" w:cs="Courier New" w:eastAsia="Courier New" w:hAnsi="Courier New"/>
+          <w:sz w:val="18"/>
+          <w:szCs w:val="18"/>
+        </w:rPr>
+        <w:br/>
+        <w:t xml:space="preserve">Untracked files:</w:t>
+      </w:r>
+      <w:r>
+        <w:rPr>
+          <w:rFonts w:ascii="Courier New" w:cs="Courier New" w:eastAsia="Courier New" w:hAnsi="Courier New"/>
+          <w:sz w:val="18"/>
+          <w:szCs w:val="18"/>
+        </w:rPr>
+        <w:br/>
+        <w:t xml:space="preserve">        ENGINEERING_LOG.md</w:t>
+      </w:r>
+      <w:r>
+        <w:rPr>
+          <w:rFonts w:ascii="Courier New" w:cs="Courier New" w:eastAsia="Courier New" w:hAnsi="Courier New"/>
+          <w:sz w:val="18"/>
+          <w:szCs w:val="18"/>
+        </w:rPr>
+        <w:br/>
+        <w:t xml:space="preserve">        docs/AI_USE_LOG.md</w:t>
+      </w:r>
+      <w:r>
+        <w:rPr>
+          <w:rFonts w:ascii="Courier New" w:cs="Courier New" w:eastAsia="Courier New" w:hAnsi="Courier New"/>
+          <w:sz w:val="18"/>
+          <w:szCs w:val="18"/>
+        </w:rPr>
+        <w:br/>
+        <w:t xml:space="preserve">        docs/CISC699_Launch_Packet.docx</w:t>
+      </w:r>
+    </w:p>
+    <w:p>
+      <w:pPr>
+        <w:spacing w:after="120" w:before="0" w:line="264"/>
+        <w:jc w:val="both"/>
+      </w:pPr>
+      <w:r>
+        <w:rPr>
+          <w:rFonts w:ascii="Calibri" w:cs="Calibri" w:eastAsia="Calibri" w:hAnsi="Calibri"/>
+          <w:sz w:val="22"/>
+          <w:szCs w:val="22"/>
+        </w:rPr>
+        <w:t xml:space="preserve">These three files were committed immediately after this capture (commit 1245a4a, "Add CISC 699 launch packet, engineering log, and AI-use log"); the repository is clean as of submission.</w:t>
+      </w:r>
+    </w:p>
+    <w:p>
+      <w:pPr>
+        <w:keepNext/>
+        <w:spacing w:after="60" w:before="120" w:line="264"/>
+      </w:pPr>
+      <w:r>
+        <w:rPr>
+          <w:rFonts w:ascii="Calibri" w:cs="Calibri" w:eastAsia="Calibri" w:hAnsi="Calibri"/>
+          <w:b/>
+          <w:bCs/>
+          <w:i/>
+          <w:iCs/>
+          <w:sz w:val="22"/>
+          <w:szCs w:val="22"/>
+        </w:rPr>
+        <w:t xml:space="preserve">Folder structure</w:t>
+      </w:r>
+    </w:p>
+    <w:p>
+      <w:pPr>
+        <w:pBdr>
+          <w:top w:val="single" w:color="CCCCCC" w:sz="2"/>
+          <w:bottom w:val="single" w:color="CCCCCC" w:sz="2"/>
+          <w:left w:val="single" w:color="CCCCCC" w:sz="2"/>
+          <w:right w:val="single" w:color="CCCCCC" w:sz="2"/>
+        </w:pBdr>
+        <w:shd w:fill="F2F2F2" w:val="clear"/>
+        <w:spacing w:after="160" w:before="80" w:line="230"/>
+      </w:pPr>
+      <w:r>
+        <w:rPr>
+          <w:rFonts w:ascii="Courier New" w:cs="Courier New" w:eastAsia="Courier New" w:hAnsi="Courier New"/>
+          <w:sz w:val="18"/>
+          <w:szCs w:val="18"/>
+        </w:rPr>
+        <w:t xml:space="preserve">% find . -maxdepth 2 -not -path '*/node_modules*' -not -path '*/.git*' -not -path '*/cdk.out*' | sort</w:t>
+      </w:r>
+      <w:r>
+        <w:rPr>
+          <w:rFonts w:ascii="Courier New" w:cs="Courier New" w:eastAsia="Courier New" w:hAnsi="Courier New"/>
+          <w:sz w:val="18"/>
+          <w:szCs w:val="18"/>
+        </w:rPr>
+        <w:br/>
+        <w:t xml:space="preserve">.</w:t>
+      </w:r>
+      <w:r>
+        <w:rPr>
+          <w:rFonts w:ascii="Courier New" w:cs="Courier New" w:eastAsia="Courier New" w:hAnsi="Courier New"/>
+          <w:sz w:val="18"/>
+          <w:szCs w:val="18"/>
+        </w:rPr>
+        <w:br/>
+        <w:t xml:space="preserve">./.claude</w:t>
+      </w:r>
+      <w:r>
+        <w:rPr>
+          <w:rFonts w:ascii="Courier New" w:cs="Courier New" w:eastAsia="Courier New" w:hAnsi="Courier New"/>
+          <w:sz w:val="18"/>
+          <w:szCs w:val="18"/>
+        </w:rPr>
+        <w:br/>
+        <w:t xml:space="preserve">./.claude/launch.json</w:t>
+      </w:r>
+      <w:r>
+        <w:rPr>
+          <w:rFonts w:ascii="Courier New" w:cs="Courier New" w:eastAsia="Courier New" w:hAnsi="Courier New"/>
+          <w:sz w:val="18"/>
+          <w:szCs w:val="18"/>
+        </w:rPr>
+        <w:br/>
+        <w:t xml:space="preserve">./.claude/settings.local.json</w:t>
+      </w:r>
+      <w:r>
+        <w:rPr>
+          <w:rFonts w:ascii="Courier New" w:cs="Courier New" w:eastAsia="Courier New" w:hAnsi="Courier New"/>
+          <w:sz w:val="18"/>
+          <w:szCs w:val="18"/>
+        </w:rPr>
+        <w:br/>
+        <w:t xml:space="preserve">./.DS_Store</w:t>
+      </w:r>
+      <w:r>
+        <w:rPr>
+          <w:rFonts w:ascii="Courier New" w:cs="Courier New" w:eastAsia="Courier New" w:hAnsi="Courier New"/>
+          <w:sz w:val="18"/>
+          <w:szCs w:val="18"/>
+        </w:rPr>
+        <w:br/>
+        <w:t xml:space="preserve">./bin</w:t>
+      </w:r>
+      <w:r>
+        <w:rPr>
+          <w:rFonts w:ascii="Courier New" w:cs="Courier New" w:eastAsia="Courier New" w:hAnsi="Courier New"/>
+          <w:sz w:val="18"/>
+          <w:szCs w:val="18"/>
+        </w:rPr>
+        <w:br/>
+        <w:t xml:space="preserve">./bin/rescuenet.ts</w:t>
+      </w:r>
+      <w:r>
+        <w:rPr>
+          <w:rFonts w:ascii="Courier New" w:cs="Courier New" w:eastAsia="Courier New" w:hAnsi="Courier New"/>
+          <w:sz w:val="18"/>
+          <w:szCs w:val="18"/>
+        </w:rPr>
+        <w:br/>
+        <w:t xml:space="preserve">./cdk.json</w:t>
+      </w:r>
+      <w:r>
+        <w:rPr>
+          <w:rFonts w:ascii="Courier New" w:cs="Courier New" w:eastAsia="Courier New" w:hAnsi="Courier New"/>
+          <w:sz w:val="18"/>
+          <w:szCs w:val="18"/>
+        </w:rPr>
+        <w:br/>
+        <w:t xml:space="preserve">./docs</w:t>
+      </w:r>
+      <w:r>
+        <w:rPr>
+          <w:rFonts w:ascii="Courier New" w:cs="Courier New" w:eastAsia="Courier New" w:hAnsi="Courier New"/>
+          <w:sz w:val="18"/>
+          <w:szCs w:val="18"/>
+        </w:rPr>
+        <w:br/>
+        <w:t xml:space="preserve">./docs/AI_USE_LOG.md</w:t>
+      </w:r>
+      <w:r>
+        <w:rPr>
+          <w:rFonts w:ascii="Courier New" w:cs="Courier New" w:eastAsia="Courier New" w:hAnsi="Courier New"/>
+          <w:sz w:val="18"/>
+          <w:szCs w:val="18"/>
+        </w:rPr>
+        <w:br/>
+        <w:t xml:space="preserve">./docs/CISC699_Launch_Packet.docx</w:t>
+      </w:r>
+      <w:r>
+        <w:rPr>
+          <w:rFonts w:ascii="Courier New" w:cs="Courier New" w:eastAsia="Courier New" w:hAnsi="Courier New"/>
+          <w:sz w:val="18"/>
+          <w:szCs w:val="18"/>
+        </w:rPr>
+        <w:br/>
+        <w:t xml:space="preserve">./docs/PRESENTATION.md</w:t>
+      </w:r>
+      <w:r>
+        <w:rPr>
+          <w:rFonts w:ascii="Courier New" w:cs="Courier New" w:eastAsia="Courier New" w:hAnsi="Courier New"/>
+          <w:sz w:val="18"/>
+          <w:szCs w:val="18"/>
+        </w:rPr>
+        <w:br/>
+        <w:t xml:space="preserve">./docs/rescuenet-architecture.pdf</w:t>
+      </w:r>
+      <w:r>
+        <w:rPr>
+          <w:rFonts w:ascii="Courier New" w:cs="Courier New" w:eastAsia="Courier New" w:hAnsi="Courier New"/>
+          <w:sz w:val="18"/>
+          <w:szCs w:val="18"/>
+        </w:rPr>
+        <w:br/>
+        <w:t xml:space="preserve">./docs/rescuenet-usecases.pdf</w:t>
+      </w:r>
+      <w:r>
+        <w:rPr>
+          <w:rFonts w:ascii="Courier New" w:cs="Courier New" w:eastAsia="Courier New" w:hAnsi="Courier New"/>
+          <w:sz w:val="18"/>
+          <w:szCs w:val="18"/>
+        </w:rPr>
+        <w:br/>
+        <w:t xml:space="preserve">./ENGINEERING_LOG.md</w:t>
+      </w:r>
+      <w:r>
+        <w:rPr>
+          <w:rFonts w:ascii="Courier New" w:cs="Courier New" w:eastAsia="Courier New" w:hAnsi="Courier New"/>
+          <w:sz w:val="18"/>
+          <w:szCs w:val="18"/>
+        </w:rPr>
+        <w:br/>
+        <w:t xml:space="preserve">./lambda</w:t>
+      </w:r>
+      <w:r>
+        <w:rPr>
+          <w:rFonts w:ascii="Courier New" w:cs="Courier New" w:eastAsia="Courier New" w:hAnsi="Courier New"/>
+          <w:sz w:val="18"/>
+          <w:szCs w:val="18"/>
+        </w:rPr>
+        <w:br/>
+        <w:t xml:space="preserve">./lambda/arbitrator</w:t>
+      </w:r>
+      <w:r>
+        <w:rPr>
+          <w:rFonts w:ascii="Courier New" w:cs="Courier New" w:eastAsia="Courier New" w:hAnsi="Courier New"/>
+          <w:sz w:val="18"/>
+          <w:szCs w:val="18"/>
+        </w:rPr>
+        <w:br/>
+        <w:t xml:space="preserve">./lambda/case-stream-publisher</w:t>
+      </w:r>
+      <w:r>
+        <w:rPr>
+          <w:rFonts w:ascii="Courier New" w:cs="Courier New" w:eastAsia="Courier New" w:hAnsi="Courier New"/>
+          <w:sz w:val="18"/>
+          <w:szCs w:val="18"/>
+        </w:rPr>
+        <w:br/>
+        <w:t xml:space="preserve">./lambda/confirmation-handler</w:t>
+      </w:r>
+      <w:r>
+        <w:rPr>
+          <w:rFonts w:ascii="Courier New" w:cs="Courier New" w:eastAsia="Courier New" w:hAnsi="Courier New"/>
+          <w:sz w:val="18"/>
+          <w:szCs w:val="18"/>
+        </w:rPr>
+        <w:br/>
+        <w:t xml:space="preserve">./lambda/dedup-agent</w:t>
+      </w:r>
+      <w:r>
+        <w:rPr>
+          <w:rFonts w:ascii="Courier New" w:cs="Courier New" w:eastAsia="Courier New" w:hAnsi="Courier New"/>
+          <w:sz w:val="18"/>
+          <w:szCs w:val="18"/>
+        </w:rPr>
+        <w:br/>
+        <w:t xml:space="preserve">./lambda/geocoding-agent</w:t>
+      </w:r>
+      <w:r>
+        <w:rPr>
+          <w:rFonts w:ascii="Courier New" w:cs="Courier New" w:eastAsia="Courier New" w:hAnsi="Courier New"/>
+          <w:sz w:val="18"/>
+          <w:szCs w:val="18"/>
+        </w:rPr>
+        <w:br/>
+        <w:t xml:space="preserve">./lambda/get-case-photos</w:t>
+      </w:r>
+      <w:r>
+        <w:rPr>
+          <w:rFonts w:ascii="Courier New" w:cs="Courier New" w:eastAsia="Courier New" w:hAnsi="Courier New"/>
+          <w:sz w:val="18"/>
+          <w:szCs w:val="18"/>
+        </w:rPr>
+        <w:br/>
+        <w:t xml:space="preserve">./lambda/image-agent</w:t>
+      </w:r>
+      <w:r>
+        <w:rPr>
+          <w:rFonts w:ascii="Courier New" w:cs="Courier New" w:eastAsia="Courier New" w:hAnsi="Courier New"/>
+          <w:sz w:val="18"/>
+          <w:szCs w:val="18"/>
+        </w:rPr>
+        <w:br/>
+        <w:t xml:space="preserve">./lambda/intake</w:t>
+      </w:r>
+      <w:r>
+        <w:rPr>
+          <w:rFonts w:ascii="Courier New" w:cs="Courier New" w:eastAsia="Courier New" w:hAnsi="Courier New"/>
+          <w:sz w:val="18"/>
+          <w:szCs w:val="18"/>
+        </w:rPr>
+        <w:br/>
+        <w:t xml:space="preserve">./lambda/list-nearby-cases</w:t>
+      </w:r>
+      <w:r>
+        <w:rPr>
+          <w:rFonts w:ascii="Courier New" w:cs="Courier New" w:eastAsia="Courier New" w:hAnsi="Courier New"/>
+          <w:sz w:val="18"/>
+          <w:szCs w:val="18"/>
+        </w:rPr>
+        <w:br/>
+        <w:t xml:space="preserve">./lambda/needs-profile</w:t>
+      </w:r>
+      <w:r>
+        <w:rPr>
+          <w:rFonts w:ascii="Courier New" w:cs="Courier New" w:eastAsia="Courier New" w:hAnsi="Courier New"/>
+          <w:sz w:val="18"/>
+          <w:szCs w:val="18"/>
+        </w:rPr>
+        <w:br/>
+        <w:t xml:space="preserve">./lambda/shared</w:t>
+      </w:r>
+      <w:r>
+        <w:rPr>
+          <w:rFonts w:ascii="Courier New" w:cs="Courier New" w:eastAsia="Courier New" w:hAnsi="Courier New"/>
+          <w:sz w:val="18"/>
+          <w:szCs w:val="18"/>
+        </w:rPr>
+        <w:br/>
+        <w:t xml:space="preserve">./lambda/slack-webhook</w:t>
+      </w:r>
+      <w:r>
+        <w:rPr>
+          <w:rFonts w:ascii="Courier New" w:cs="Courier New" w:eastAsia="Courier New" w:hAnsi="Courier New"/>
+          <w:sz w:val="18"/>
+          <w:szCs w:val="18"/>
+        </w:rPr>
+        <w:br/>
+        <w:t xml:space="preserve">./lambda/tier1-agent</w:t>
+      </w:r>
+      <w:r>
+        <w:rPr>
+          <w:rFonts w:ascii="Courier New" w:cs="Courier New" w:eastAsia="Courier New" w:hAnsi="Courier New"/>
+          <w:sz w:val="18"/>
+          <w:szCs w:val="18"/>
+        </w:rPr>
+        <w:br/>
+        <w:t xml:space="preserve">./lambda/tier2-agent</w:t>
+      </w:r>
+      <w:r>
+        <w:rPr>
+          <w:rFonts w:ascii="Courier New" w:cs="Courier New" w:eastAsia="Courier New" w:hAnsi="Courier New"/>
+          <w:sz w:val="18"/>
+          <w:szCs w:val="18"/>
+        </w:rPr>
+        <w:br/>
+        <w:t xml:space="preserve">./lib</w:t>
+      </w:r>
+      <w:r>
+        <w:rPr>
+          <w:rFonts w:ascii="Courier New" w:cs="Courier New" w:eastAsia="Courier New" w:hAnsi="Courier New"/>
+          <w:sz w:val="18"/>
+          <w:szCs w:val="18"/>
+        </w:rPr>
+        <w:br/>
+        <w:t xml:space="preserve">./lib/constants.ts</w:t>
+      </w:r>
+      <w:r>
+        <w:rPr>
+          <w:rFonts w:ascii="Courier New" w:cs="Courier New" w:eastAsia="Courier New" w:hAnsi="Courier New"/>
+          <w:sz w:val="18"/>
+          <w:szCs w:val="18"/>
+        </w:rPr>
+        <w:br/>
+        <w:t xml:space="preserve">./lib/schema.graphql</w:t>
+      </w:r>
+      <w:r>
+        <w:rPr>
+          <w:rFonts w:ascii="Courier New" w:cs="Courier New" w:eastAsia="Courier New" w:hAnsi="Courier New"/>
+          <w:sz w:val="18"/>
+          <w:szCs w:val="18"/>
+        </w:rPr>
+        <w:br/>
+        <w:t xml:space="preserve">./lib/stacks</w:t>
+      </w:r>
+      <w:r>
+        <w:rPr>
+          <w:rFonts w:ascii="Courier New" w:cs="Courier New" w:eastAsia="Courier New" w:hAnsi="Courier New"/>
+          <w:sz w:val="18"/>
+          <w:szCs w:val="18"/>
+        </w:rPr>
+        <w:br/>
+        <w:t xml:space="preserve">./mobile</w:t>
+      </w:r>
+      <w:r>
+        <w:rPr>
+          <w:rFonts w:ascii="Courier New" w:cs="Courier New" w:eastAsia="Courier New" w:hAnsi="Courier New"/>
+          <w:sz w:val="18"/>
+          <w:szCs w:val="18"/>
+        </w:rPr>
+        <w:br/>
+        <w:t xml:space="preserve">./mobile/.claude</w:t>
+      </w:r>
+      <w:r>
+        <w:rPr>
+          <w:rFonts w:ascii="Courier New" w:cs="Courier New" w:eastAsia="Courier New" w:hAnsi="Courier New"/>
+          <w:sz w:val="18"/>
+          <w:szCs w:val="18"/>
+        </w:rPr>
+        <w:br/>
+        <w:t xml:space="preserve">./mobile/.env</w:t>
+      </w:r>
+      <w:r>
+        <w:rPr>
+          <w:rFonts w:ascii="Courier New" w:cs="Courier New" w:eastAsia="Courier New" w:hAnsi="Courier New"/>
+          <w:sz w:val="18"/>
+          <w:szCs w:val="18"/>
+        </w:rPr>
+        <w:br/>
+        <w:t xml:space="preserve">./mobile/.env.example</w:t>
+      </w:r>
+      <w:r>
+        <w:rPr>
+          <w:rFonts w:ascii="Courier New" w:cs="Courier New" w:eastAsia="Courier New" w:hAnsi="Courier New"/>
+          <w:sz w:val="18"/>
+          <w:szCs w:val="18"/>
+        </w:rPr>
+        <w:br/>
+        <w:t xml:space="preserve">./mobile/.expo</w:t>
+      </w:r>
+      <w:r>
+        <w:rPr>
+          <w:rFonts w:ascii="Courier New" w:cs="Courier New" w:eastAsia="Courier New" w:hAnsi="Courier New"/>
+          <w:sz w:val="18"/>
+          <w:szCs w:val="18"/>
+        </w:rPr>
+        <w:br/>
+        <w:t xml:space="preserve">./mobile/AGENTS.md</w:t>
+      </w:r>
+      <w:r>
+        <w:rPr>
+          <w:rFonts w:ascii="Courier New" w:cs="Courier New" w:eastAsia="Courier New" w:hAnsi="Courier New"/>
+          <w:sz w:val="18"/>
+          <w:szCs w:val="18"/>
+        </w:rPr>
+        <w:br/>
+        <w:t xml:space="preserve">./mobile/app</w:t>
+      </w:r>
+      <w:r>
+        <w:rPr>
+          <w:rFonts w:ascii="Courier New" w:cs="Courier New" w:eastAsia="Courier New" w:hAnsi="Courier New"/>
+          <w:sz w:val="18"/>
+          <w:szCs w:val="18"/>
+        </w:rPr>
+        <w:br/>
+        <w:t xml:space="preserve">./mobile/app.json</w:t>
+      </w:r>
+      <w:r>
+        <w:rPr>
+          <w:rFonts w:ascii="Courier New" w:cs="Courier New" w:eastAsia="Courier New" w:hAnsi="Courier New"/>
+          <w:sz w:val="18"/>
+          <w:szCs w:val="18"/>
+        </w:rPr>
+        <w:br/>
+        <w:t xml:space="preserve">./mobile/assets</w:t>
+      </w:r>
+      <w:r>
+        <w:rPr>
+          <w:rFonts w:ascii="Courier New" w:cs="Courier New" w:eastAsia="Courier New" w:hAnsi="Courier New"/>
+          <w:sz w:val="18"/>
+          <w:szCs w:val="18"/>
+        </w:rPr>
+        <w:br/>
+        <w:t xml:space="preserve">./mobile/CLAUDE.md</w:t>
+      </w:r>
+      <w:r>
+        <w:rPr>
+          <w:rFonts w:ascii="Courier New" w:cs="Courier New" w:eastAsia="Courier New" w:hAnsi="Courier New"/>
+          <w:sz w:val="18"/>
+          <w:szCs w:val="18"/>
+        </w:rPr>
+        <w:br/>
+        <w:t xml:space="preserve">./mobile/components</w:t>
+      </w:r>
+      <w:r>
+        <w:rPr>
+          <w:rFonts w:ascii="Courier New" w:cs="Courier New" w:eastAsia="Courier New" w:hAnsi="Courier New"/>
+          <w:sz w:val="18"/>
+          <w:szCs w:val="18"/>
+        </w:rPr>
+        <w:br/>
+        <w:t xml:space="preserve">./mobile/ios</w:t>
+      </w:r>
+      <w:r>
+        <w:rPr>
+          <w:rFonts w:ascii="Courier New" w:cs="Courier New" w:eastAsia="Courier New" w:hAnsi="Courier New"/>
+          <w:sz w:val="18"/>
+          <w:szCs w:val="18"/>
+        </w:rPr>
+        <w:br/>
+        <w:t xml:space="preserve">./mobile/lib</w:t>
+      </w:r>
+      <w:r>
+        <w:rPr>
+          <w:rFonts w:ascii="Courier New" w:cs="Courier New" w:eastAsia="Courier New" w:hAnsi="Courier New"/>
+          <w:sz w:val="18"/>
+          <w:szCs w:val="18"/>
+        </w:rPr>
+        <w:br/>
+        <w:t xml:space="preserve">./mobile/package-lock.json</w:t>
+      </w:r>
+      <w:r>
+        <w:rPr>
+          <w:rFonts w:ascii="Courier New" w:cs="Courier New" w:eastAsia="Courier New" w:hAnsi="Courier New"/>
+          <w:sz w:val="18"/>
+          <w:szCs w:val="18"/>
+        </w:rPr>
+        <w:br/>
+        <w:t xml:space="preserve">./mobile/package.json</w:t>
+      </w:r>
+      <w:r>
+        <w:rPr>
+          <w:rFonts w:ascii="Courier New" w:cs="Courier New" w:eastAsia="Courier New" w:hAnsi="Courier New"/>
+          <w:sz w:val="18"/>
+          <w:szCs w:val="18"/>
+        </w:rPr>
+        <w:br/>
+        <w:t xml:space="preserve">./mobile/patches</w:t>
+      </w:r>
+      <w:r>
+        <w:rPr>
+          <w:rFonts w:ascii="Courier New" w:cs="Courier New" w:eastAsia="Courier New" w:hAnsi="Courier New"/>
+          <w:sz w:val="18"/>
+          <w:szCs w:val="18"/>
+        </w:rPr>
+        <w:br/>
+        <w:t xml:space="preserve">./mobile/README.md</w:t>
+      </w:r>
+      <w:r>
+        <w:rPr>
+          <w:rFonts w:ascii="Courier New" w:cs="Courier New" w:eastAsia="Courier New" w:hAnsi="Courier New"/>
+          <w:sz w:val="18"/>
+          <w:szCs w:val="18"/>
+        </w:rPr>
+        <w:br/>
+        <w:t xml:space="preserve">./mobile/tsconfig.json</w:t>
+      </w:r>
+      <w:r>
+        <w:rPr>
+          <w:rFonts w:ascii="Courier New" w:cs="Courier New" w:eastAsia="Courier New" w:hAnsi="Courier New"/>
+          <w:sz w:val="18"/>
+          <w:szCs w:val="18"/>
+        </w:rPr>
+        <w:br/>
+        <w:t xml:space="preserve">./package-lock.json</w:t>
+      </w:r>
+      <w:r>
+        <w:rPr>
+          <w:rFonts w:ascii="Courier New" w:cs="Courier New" w:eastAsia="Courier New" w:hAnsi="Courier New"/>
+          <w:sz w:val="18"/>
+          <w:szCs w:val="18"/>
+        </w:rPr>
+        <w:br/>
+        <w:t xml:space="preserve">./package.json</w:t>
+      </w:r>
+      <w:r>
+        <w:rPr>
+          <w:rFonts w:ascii="Courier New" w:cs="Courier New" w:eastAsia="Courier New" w:hAnsi="Courier New"/>
+          <w:sz w:val="18"/>
+          <w:szCs w:val="18"/>
+        </w:rPr>
+        <w:br/>
+        <w:t xml:space="preserve">./README.md</w:t>
+      </w:r>
+      <w:r>
+        <w:rPr>
+          <w:rFonts w:ascii="Courier New" w:cs="Courier New" w:eastAsia="Courier New" w:hAnsi="Courier New"/>
+          <w:sz w:val="18"/>
+          <w:szCs w:val="18"/>
+        </w:rPr>
+        <w:br/>
+        <w:t xml:space="preserve">./scripts</w:t>
+      </w:r>
+      <w:r>
+        <w:rPr>
+          <w:rFonts w:ascii="Courier New" w:cs="Courier New" w:eastAsia="Courier New" w:hAnsi="Courier New"/>
+          <w:sz w:val="18"/>
+          <w:szCs w:val="18"/>
+        </w:rPr>
+        <w:br/>
+        <w:t xml:space="preserve">./scripts/demo.sh</w:t>
+      </w:r>
+      <w:r>
+        <w:rPr>
+          <w:rFonts w:ascii="Courier New" w:cs="Courier New" w:eastAsia="Courier New" w:hAnsi="Courier New"/>
+          <w:sz w:val="18"/>
+          <w:szCs w:val="18"/>
+        </w:rPr>
+        <w:br/>
+        <w:t xml:space="preserve">./tsconfig.json</w:t>
       </w:r>
     </w:p>
     <w:p>

</xml_diff>

<commit_message>
Add Appendix A (engineering log) to launch packet
Co-Authored-By: Claude Sonnet 5 <noreply@anthropic.com>
</commit_message>
<xml_diff>
--- a/docs/CISC699_Launch_Packet.docx
+++ b/docs/CISC699_Launch_Packet.docx
@@ -6013,6 +6013,252 @@
           <w:szCs w:val="22"/>
         </w:rPr>
         <w:t xml:space="preserve">The scope decisions themselves were not AI defaults: selecting Candidate A over B and C (Section 2), setting the success criteria (Section 3.6), determining what qualifies as a gated stretch goal versus what stays out of scope regardless (Section 3.5), and every open item raised in the Supervisor Briefing Note (Section 7) reflect the student's own judgment about what this project needs, not an unreviewed AI output.</w:t>
+      </w:r>
+    </w:p>
+    <w:p>
+      <w:r>
+        <w:br w:type="page"/>
+      </w:r>
+    </w:p>
+    <w:p>
+      <w:pPr>
+        <w:keepNext/>
+        <w:pBdr>
+          <w:bottom w:val="single" w:color="0F4C46" w:sz="8" w:space="4"/>
+        </w:pBdr>
+        <w:spacing w:after="140" w:before="320" w:line="264"/>
+      </w:pPr>
+      <w:r>
+        <w:rPr>
+          <w:rFonts w:ascii="Calibri" w:cs="Calibri" w:eastAsia="Calibri" w:hAnsi="Calibri"/>
+          <w:b/>
+          <w:bCs/>
+          <w:color w:val="0F4C46"/>
+          <w:sz w:val="30"/>
+          <w:szCs w:val="30"/>
+        </w:rPr>
+        <w:t xml:space="preserve">Appendix A: Engineering Log</w:t>
+      </w:r>
+    </w:p>
+    <w:p>
+      <w:pPr>
+        <w:spacing w:after="120" w:before="0" w:line="264"/>
+        <w:jc w:val="both"/>
+      </w:pPr>
+      <w:r>
+        <w:rPr>
+          <w:rFonts w:ascii="Calibri" w:cs="Calibri" w:eastAsia="Calibri" w:hAnsi="Calibri"/>
+          <w:sz w:val="22"/>
+          <w:szCs w:val="22"/>
+        </w:rPr>
+        <w:t xml:space="preserve">Reproduced verbatim from ENGINEERING_LOG.md at the project root, maintained as a running, dated record throughout the term per the course's project-management expectations.</w:t>
+      </w:r>
+    </w:p>
+    <w:p>
+      <w:pPr>
+        <w:keepNext/>
+        <w:spacing w:after="100" w:before="200" w:line="264"/>
+      </w:pPr>
+      <w:r>
+        <w:rPr>
+          <w:rFonts w:ascii="Calibri" w:cs="Calibri" w:eastAsia="Calibri" w:hAnsi="Calibri"/>
+          <w:b/>
+          <w:bCs/>
+          <w:color w:val="0A3A35"/>
+          <w:sz w:val="24"/>
+          <w:szCs w:val="24"/>
+        </w:rPr>
+        <w:t xml:space="preserve">Week 1 — 2026-09-06</w:t>
+      </w:r>
+    </w:p>
+    <w:p>
+      <w:pPr>
+        <w:keepNext/>
+        <w:spacing w:after="60" w:before="120" w:line="264"/>
+      </w:pPr>
+      <w:r>
+        <w:rPr>
+          <w:rFonts w:ascii="Calibri" w:cs="Calibri" w:eastAsia="Calibri" w:hAnsi="Calibri"/>
+          <w:b/>
+          <w:bCs/>
+          <w:i/>
+          <w:iCs/>
+          <w:sz w:val="22"/>
+          <w:szCs w:val="22"/>
+        </w:rPr>
+        <w:t xml:space="preserve">Context</w:t>
+      </w:r>
+    </w:p>
+    <w:p>
+      <w:pPr>
+        <w:spacing w:after="120" w:before="0" w:line="264"/>
+        <w:jc w:val="both"/>
+      </w:pPr>
+      <w:r>
+        <w:rPr>
+          <w:rFonts w:ascii="Calibri" w:cs="Calibri" w:eastAsia="Calibri" w:hAnsi="Calibri"/>
+          <w:sz w:val="22"/>
+          <w:szCs w:val="22"/>
+        </w:rPr>
+        <w:t xml:space="preserve">CISC 699 launch packet due. RescueNet already exists as a deployed system (5 CDK stacks, 12 Lambda agents, blackboard architecture over DynamoDB + EventBridge, AppSync GraphQL API, Expo mobile app) from the ISEM 502 → GRAD 695 sequence. Supervisor approved continuing it into CISC 699 with a specific mandate: harden the case-routing/arbitration algorithm.</w:t>
+      </w:r>
+    </w:p>
+    <w:p>
+      <w:pPr>
+        <w:keepNext/>
+        <w:spacing w:after="60" w:before="120" w:line="264"/>
+      </w:pPr>
+      <w:r>
+        <w:rPr>
+          <w:rFonts w:ascii="Calibri" w:cs="Calibri" w:eastAsia="Calibri" w:hAnsi="Calibri"/>
+          <w:b/>
+          <w:bCs/>
+          <w:i/>
+          <w:iCs/>
+          <w:sz w:val="22"/>
+          <w:szCs w:val="22"/>
+        </w:rPr>
+        <w:t xml:space="preserve">Findings carried in from prior audit work (this term, pre-syllabus)</w:t>
+      </w:r>
+    </w:p>
+    <w:p>
+      <w:pPr>
+        <w:spacing w:after="80" w:before="0" w:line="264"/>
+        <w:ind w:left="450" w:hanging="270"/>
+        <w:jc w:val="both"/>
+      </w:pPr>
+      <w:r>
+        <w:rPr>
+          <w:rFonts w:ascii="Calibri" w:cs="Calibri" w:eastAsia="Calibri" w:hAnsi="Calibri"/>
+          <w:sz w:val="22"/>
+          <w:szCs w:val="22"/>
+        </w:rPr>
+        <w:t xml:space="preserve">•  lambda/arbitrator/index.ts's computeMatchScore uses hand-picked normalization constants (slots/5, window/120, distance/30) with no calibration against real outcome data.</w:t>
+      </w:r>
+    </w:p>
+    <w:p>
+      <w:pPr>
+        <w:spacing w:after="80" w:before="0" w:line="264"/>
+        <w:ind w:left="450" w:hanging="270"/>
+        <w:jc w:val="both"/>
+      </w:pPr>
+      <w:r>
+        <w:rPr>
+          <w:rFonts w:ascii="Calibri" w:cs="Calibri" w:eastAsia="Calibri" w:hAnsi="Calibri"/>
+          <w:sz w:val="22"/>
+          <w:szCs w:val="22"/>
+        </w:rPr>
+        <w:t xml:space="preserve">•  specScore = bid.acceptedSpecies ? 0.85 : 0.50 checks whether the array exists, not whether the species actually matches — effectively a near-constant term. Confirmed defect, not a design choice.</w:t>
+      </w:r>
+    </w:p>
+    <w:p>
+      <w:pPr>
+        <w:spacing w:after="80" w:before="0" w:line="264"/>
+        <w:ind w:left="450" w:hanging="270"/>
+        <w:jc w:val="both"/>
+      </w:pPr>
+      <w:r>
+        <w:rPr>
+          <w:rFonts w:ascii="Calibri" w:cs="Calibri" w:eastAsia="Calibri" w:hAnsi="Calibri"/>
+          <w:sz w:val="22"/>
+          <w:szCs w:val="22"/>
+        </w:rPr>
+        <w:t xml:space="preserve">•  lambda/geocoding-agent/index.ts has real AWS Location Service integration code, but the Place Index resource was never provisioned in the CDK stack, so every request falls back to raw coordinates. Verified live by submitting a real test case and reading the resulting DynamoDB record directly.</w:t>
+      </w:r>
+    </w:p>
+    <w:p>
+      <w:pPr>
+        <w:spacing w:after="80" w:before="0" w:line="264"/>
+        <w:ind w:left="450" w:hanging="270"/>
+        <w:jc w:val="both"/>
+      </w:pPr>
+      <w:r>
+        <w:rPr>
+          <w:rFonts w:ascii="Calibri" w:cs="Calibri" w:eastAsia="Calibri" w:hAnsi="Calibri"/>
+          <w:sz w:val="22"/>
+          <w:szCs w:val="22"/>
+        </w:rPr>
+        <w:t xml:space="preserve">•  A real end-to-end case (injured cat, Washington Square Park coordinates) was submitted through the live rescuenet-intake Lambda on 2026-08-30; the full pipeline (image-agent → geocoding-agent → needs-profile → dedup-agent → arbitrator → confirmation-handler) completed in ~28 seconds, producing genuine Bedrock reasoning output, a real computed match score (0.8791300139891632), and confirming the assignment to shelter-manhattan-acc. This case is retained in rescuenet-cases as the first real evaluation data point for the routing-hardening work.</w:t>
+      </w:r>
+    </w:p>
+    <w:p>
+      <w:pPr>
+        <w:keepNext/>
+        <w:spacing w:after="60" w:before="120" w:line="264"/>
+      </w:pPr>
+      <w:r>
+        <w:rPr>
+          <w:rFonts w:ascii="Calibri" w:cs="Calibri" w:eastAsia="Calibri" w:hAnsi="Calibri"/>
+          <w:b/>
+          <w:bCs/>
+          <w:i/>
+          <w:iCs/>
+          <w:sz w:val="22"/>
+          <w:szCs w:val="22"/>
+        </w:rPr>
+        <w:t xml:space="preserve">Decisions made this week</w:t>
+      </w:r>
+    </w:p>
+    <w:p>
+      <w:pPr>
+        <w:spacing w:after="80" w:before="0" w:line="264"/>
+        <w:ind w:left="450" w:hanging="270"/>
+        <w:jc w:val="both"/>
+      </w:pPr>
+      <w:r>
+        <w:rPr>
+          <w:rFonts w:ascii="Calibri" w:cs="Calibri" w:eastAsia="Calibri" w:hAnsi="Calibri"/>
+          <w:sz w:val="22"/>
+          <w:szCs w:val="22"/>
+        </w:rPr>
+        <w:t xml:space="preserve">•  Scope for CISC 699: harden the routing/arbitration scoring function specifically (fix the confirmed defect, replace hand-picked weights with an AHP-derived set, build a comparison evaluation harness), not the shelter-onboarding portal feature work — that remains a separate, already-prototyped track outside this course's graded artifact.</w:t>
+      </w:r>
+    </w:p>
+    <w:p>
+      <w:pPr>
+        <w:spacing w:after="80" w:before="0" w:line="264"/>
+        <w:ind w:left="450" w:hanging="270"/>
+        <w:jc w:val="both"/>
+      </w:pPr>
+      <w:r>
+        <w:rPr>
+          <w:rFonts w:ascii="Calibri" w:cs="Calibri" w:eastAsia="Calibri" w:hAnsi="Calibri"/>
+          <w:sz w:val="22"/>
+          <w:szCs w:val="22"/>
+        </w:rPr>
+        <w:t xml:space="preserve">•  Repository: local git repo exists at the project root (one commit as of this term's start). GitHub remote setup status: see Section 5.</w:t>
+      </w:r>
+    </w:p>
+    <w:p>
+      <w:pPr>
+        <w:keepNext/>
+        <w:spacing w:after="60" w:before="120" w:line="264"/>
+      </w:pPr>
+      <w:r>
+        <w:rPr>
+          <w:rFonts w:ascii="Calibri" w:cs="Calibri" w:eastAsia="Calibri" w:hAnsi="Calibri"/>
+          <w:b/>
+          <w:bCs/>
+          <w:i/>
+          <w:iCs/>
+          <w:sz w:val="22"/>
+          <w:szCs w:val="22"/>
+        </w:rPr>
+        <w:t xml:space="preserve">Open questions for supervisor</w:t>
+      </w:r>
+    </w:p>
+    <w:p>
+      <w:pPr>
+        <w:spacing w:after="120" w:before="0" w:line="264"/>
+        <w:jc w:val="both"/>
+      </w:pPr>
+      <w:r>
+        <w:rPr>
+          <w:rFonts w:ascii="Calibri" w:cs="Calibri" w:eastAsia="Calibri" w:hAnsi="Calibri"/>
+          <w:sz w:val="22"/>
+          <w:szCs w:val="22"/>
+        </w:rPr>
+        <w:t xml:space="preserve">See the Supervisor Briefing Note, Section 7.</w:t>
       </w:r>
     </w:p>
     <w:sectPr>

</xml_diff>